<commit_message>
Add accurate declaration of technical integrity and IP origin; validation plan
Co-Authored-By: Claude Sonnet 5.5 <noreply@anthropic.com>
Claude-Session: https://claude.ai/code/session_017BZUeEHQaLYKPYKd9kYeDi
</commit_message>
<xml_diff>
--- a/Invention_Disclosure_Format_B_FILLED.docx
+++ b/Invention_Disclosure_Format_B_FILLED.docx
@@ -9357,6 +9357,443 @@
         </w:rPr>
         <w:t xml:space="preserve"> (experimental proof of concept). Target: TRL 4 after a lab testbed run.</w:t>
       </w:r>
+    </w:p>
+    <w:p>
+      <w:pPr>
+        <w:keepNext/>
+        <w:spacing w:after="60" w:before="200"/>
+      </w:pPr>
+      <w:r>
+        <w:rPr>
+          <w:rFonts w:ascii="Arial" w:cs="Arial" w:eastAsia="Arial" w:hAnsi="Arial"/>
+          <w:b/>
+          <w:bCs/>
+          <w:i w:val="false"/>
+          <w:iCs w:val="false"/>
+          <w:sz w:val="22"/>
+          <w:szCs w:val="22"/>
+        </w:rPr>
+        <w:t xml:space="preserve">Declaration of Technical Integrity and IP Origin</w:t>
+      </w:r>
+    </w:p>
+    <w:p>
+      <w:pPr>
+        <w:keepNext w:val="false"/>
+        <w:spacing w:after="80" w:before="40"/>
+      </w:pPr>
+      <w:r>
+        <w:rPr>
+          <w:rFonts w:ascii="Arial" w:cs="Arial" w:eastAsia="Arial" w:hAnsi="Arial"/>
+          <w:b w:val="false"/>
+          <w:bCs w:val="false"/>
+          <w:i w:val="false"/>
+          <w:iCs w:val="false"/>
+          <w:sz w:val="19"/>
+          <w:szCs w:val="19"/>
+        </w:rPr>
+        <w:t xml:space="preserve">We, the undersigned, declare that to the best of our knowledge the following is true:</w:t>
+      </w:r>
+    </w:p>
+    <w:p>
+      <w:pPr>
+        <w:keepNext w:val="false"/>
+        <w:spacing w:after="80" w:before="40"/>
+      </w:pPr>
+      <w:r>
+        <w:rPr>
+          <w:rFonts w:ascii="Arial" w:cs="Arial" w:eastAsia="Arial" w:hAnsi="Arial"/>
+          <w:b w:val="false"/>
+          <w:bCs w:val="false"/>
+          <w:i w:val="false"/>
+          <w:iCs w:val="false"/>
+          <w:sz w:val="19"/>
+          <w:szCs w:val="19"/>
+        </w:rPr>
+        <w:t xml:space="preserve">1. The experimental results in Section 8 were obtained by running the accompanying reference implementation on a </w:t>
+      </w:r>
+      <w:r>
+        <w:rPr>
+          <w:rFonts w:ascii="Arial" w:cs="Arial" w:eastAsia="Arial" w:hAnsi="Arial"/>
+          <w:b/>
+          <w:bCs/>
+          <w:i w:val="false"/>
+          <w:iCs w:val="false"/>
+          <w:sz w:val="19"/>
+          <w:szCs w:val="19"/>
+        </w:rPr>
+        <w:t xml:space="preserve">synthetic (simulated) smart-home benchmark</w:t>
+      </w:r>
+      <w:r>
+        <w:rPr>
+          <w:rFonts w:ascii="Arial" w:cs="Arial" w:eastAsia="Arial" w:hAnsi="Arial"/>
+          <w:b w:val="false"/>
+          <w:bCs w:val="false"/>
+          <w:i w:val="false"/>
+          <w:iCs w:val="false"/>
+          <w:sz w:val="19"/>
+          <w:szCs w:val="19"/>
+        </w:rPr>
+        <w:t xml:space="preserve">. No laboratory, prototype or field measurements are reported, and no simulated result is presented as empirical data.</w:t>
+      </w:r>
+    </w:p>
+    <w:p>
+      <w:pPr>
+        <w:keepNext w:val="false"/>
+        <w:spacing w:after="80" w:before="40"/>
+      </w:pPr>
+      <w:r>
+        <w:rPr>
+          <w:rFonts w:ascii="Arial" w:cs="Arial" w:eastAsia="Arial" w:hAnsi="Arial"/>
+          <w:b w:val="false"/>
+          <w:bCs w:val="false"/>
+          <w:i w:val="false"/>
+          <w:iCs w:val="false"/>
+          <w:sz w:val="19"/>
+          <w:szCs w:val="19"/>
+        </w:rPr>
+        <w:t xml:space="preserve">2. The Technology Readiness Level claimed is </w:t>
+      </w:r>
+      <w:r>
+        <w:rPr>
+          <w:rFonts w:ascii="Arial" w:cs="Arial" w:eastAsia="Arial" w:hAnsi="Arial"/>
+          <w:b/>
+          <w:bCs/>
+          <w:i w:val="false"/>
+          <w:iCs w:val="false"/>
+          <w:sz w:val="19"/>
+          <w:szCs w:val="19"/>
+        </w:rPr>
+        <w:t xml:space="preserve">TRL 3</w:t>
+      </w:r>
+      <w:r>
+        <w:rPr>
+          <w:rFonts w:ascii="Arial" w:cs="Arial" w:eastAsia="Arial" w:hAnsi="Arial"/>
+          <w:b w:val="false"/>
+          <w:bCs w:val="false"/>
+          <w:i w:val="false"/>
+          <w:iCs w:val="false"/>
+          <w:sz w:val="19"/>
+          <w:szCs w:val="19"/>
+        </w:rPr>
+        <w:t xml:space="preserve"> (experimental proof of concept). No higher TRL is claimed.</w:t>
+      </w:r>
+    </w:p>
+    <w:p>
+      <w:pPr>
+        <w:keepNext w:val="false"/>
+        <w:spacing w:after="80" w:before="40"/>
+      </w:pPr>
+      <w:r>
+        <w:rPr>
+          <w:rFonts w:ascii="Arial" w:cs="Arial" w:eastAsia="Arial" w:hAnsi="Arial"/>
+          <w:b w:val="false"/>
+          <w:bCs w:val="false"/>
+          <w:i w:val="false"/>
+          <w:iCs w:val="false"/>
+          <w:sz w:val="19"/>
+          <w:szCs w:val="19"/>
+        </w:rPr>
+        <w:t xml:space="preserve">3. A generative AI assistant was used in ideation, software implementation, experiment design and drafting of this disclosure. The inventors have reviewed the content, re-run the code and results, and take responsibility for their accuracy. Use of AI tools is disclosed in line with institutional policy.</w:t>
+      </w:r>
+    </w:p>
+    <w:p>
+      <w:pPr>
+        <w:keepNext w:val="false"/>
+        <w:spacing w:after="80" w:before="40"/>
+      </w:pPr>
+      <w:r>
+        <w:rPr>
+          <w:rFonts w:ascii="Arial" w:cs="Arial" w:eastAsia="Arial" w:hAnsi="Arial"/>
+          <w:b w:val="false"/>
+          <w:bCs w:val="false"/>
+          <w:i w:val="false"/>
+          <w:iCs w:val="false"/>
+          <w:sz w:val="19"/>
+          <w:szCs w:val="19"/>
+        </w:rPr>
+        <w:t xml:space="preserve">4. The prior-art list in Section 3 was compiled by web search and has not yet been confirmed by a professional patent search.</w:t>
+      </w:r>
+    </w:p>
+    <w:p>
+      <w:pPr>
+        <w:keepNext w:val="false"/>
+        <w:spacing w:after="80" w:before="40"/>
+      </w:pPr>
+      <w:r>
+        <w:rPr>
+          <w:rFonts w:ascii="Arial" w:cs="Arial" w:eastAsia="Arial" w:hAnsi="Arial"/>
+          <w:b w:val="false"/>
+          <w:bCs w:val="false"/>
+          <w:i w:val="false"/>
+          <w:iCs w:val="false"/>
+          <w:sz w:val="19"/>
+          <w:szCs w:val="19"/>
+        </w:rPr>
+        <w:t xml:space="preserve">5. Prior publication / disclosure: ______________________________________________ (inventors to state whether any part of this work has been published, submitted or disclosed elsewhere).</w:t>
+      </w:r>
+    </w:p>
+    <w:p>
+      <w:pPr>
+        <w:keepNext w:val="false"/>
+        <w:spacing w:after="80" w:before="40"/>
+      </w:pPr>
+      <w:r>
+        <w:rPr>
+          <w:rFonts w:ascii="Arial" w:cs="Arial" w:eastAsia="Arial" w:hAnsi="Arial"/>
+          <w:b w:val="false"/>
+          <w:bCs w:val="false"/>
+          <w:i w:val="false"/>
+          <w:iCs w:val="false"/>
+          <w:sz w:val="19"/>
+          <w:szCs w:val="19"/>
+        </w:rPr>
+        <w:t xml:space="preserve">6. Inventor contributions to conception: ______________________________________________ (inventors to complete).</w:t>
+      </w:r>
+    </w:p>
+    <w:tbl>
+      <w:tblPr>
+        <w:tblW w:type="dxa" w:w="10206"/>
+        <w:tblBorders>
+          <w:top w:val="single" w:color="auto" w:sz="4"/>
+          <w:left w:val="single" w:color="auto" w:sz="4"/>
+          <w:bottom w:val="single" w:color="auto" w:sz="4"/>
+          <w:right w:val="single" w:color="auto" w:sz="4"/>
+          <w:insideH w:val="single" w:color="auto" w:sz="4"/>
+          <w:insideV w:val="single" w:color="auto" w:sz="4"/>
+        </w:tblBorders>
+      </w:tblPr>
+      <w:tblGrid>
+        <w:gridCol w:w="3969"/>
+        <w:gridCol w:w="3969"/>
+        <w:gridCol w:w="2268"/>
+      </w:tblGrid>
+      <w:tr>
+        <w:trPr>
+          <w:cantSplit/>
+          <w:tblHeader/>
+        </w:trPr>
+        <w:tc>
+          <w:tcPr>
+            <w:tcW w:type="dxa" w:w="3969"/>
+            <w:tcBorders>
+              <w:top w:val="single" w:color="999999" w:sz="4"/>
+              <w:left w:val="single" w:color="999999" w:sz="4"/>
+              <w:bottom w:val="single" w:color="999999" w:sz="4"/>
+              <w:right w:val="single" w:color="999999" w:sz="4"/>
+            </w:tcBorders>
+            <w:shd w:fill="E8EEF5" w:color="auto" w:val="clear"/>
+            <w:tcMar>
+              <w:top w:type="dxa" w:w="40"/>
+              <w:left w:type="dxa" w:w="70"/>
+              <w:bottom w:type="dxa" w:w="40"/>
+              <w:right w:type="dxa" w:w="70"/>
+            </w:tcMar>
+          </w:tcPr>
+          <w:p>
+            <w:r>
+              <w:rPr>
+                <w:rFonts w:ascii="Arial" w:cs="Arial" w:eastAsia="Arial" w:hAnsi="Arial"/>
+                <w:b/>
+                <w:bCs/>
+                <w:i w:val="false"/>
+                <w:iCs w:val="false"/>
+                <w:sz w:val="15"/>
+                <w:szCs w:val="15"/>
+              </w:rPr>
+              <w:t xml:space="preserve">Inventor name</w:t>
+            </w:r>
+          </w:p>
+        </w:tc>
+        <w:tc>
+          <w:tcPr>
+            <w:tcW w:type="dxa" w:w="3969"/>
+            <w:tcBorders>
+              <w:top w:val="single" w:color="999999" w:sz="4"/>
+              <w:left w:val="single" w:color="999999" w:sz="4"/>
+              <w:bottom w:val="single" w:color="999999" w:sz="4"/>
+              <w:right w:val="single" w:color="999999" w:sz="4"/>
+            </w:tcBorders>
+            <w:shd w:fill="E8EEF5" w:color="auto" w:val="clear"/>
+            <w:tcMar>
+              <w:top w:type="dxa" w:w="40"/>
+              <w:left w:type="dxa" w:w="70"/>
+              <w:bottom w:type="dxa" w:w="40"/>
+              <w:right w:type="dxa" w:w="70"/>
+            </w:tcMar>
+          </w:tcPr>
+          <w:p>
+            <w:r>
+              <w:rPr>
+                <w:rFonts w:ascii="Arial" w:cs="Arial" w:eastAsia="Arial" w:hAnsi="Arial"/>
+                <w:b/>
+                <w:bCs/>
+                <w:i w:val="false"/>
+                <w:iCs w:val="false"/>
+                <w:sz w:val="15"/>
+                <w:szCs w:val="15"/>
+              </w:rPr>
+              <w:t xml:space="preserve">Signature</w:t>
+            </w:r>
+          </w:p>
+        </w:tc>
+        <w:tc>
+          <w:tcPr>
+            <w:tcW w:type="dxa" w:w="2268"/>
+            <w:tcBorders>
+              <w:top w:val="single" w:color="999999" w:sz="4"/>
+              <w:left w:val="single" w:color="999999" w:sz="4"/>
+              <w:bottom w:val="single" w:color="999999" w:sz="4"/>
+              <w:right w:val="single" w:color="999999" w:sz="4"/>
+            </w:tcBorders>
+            <w:shd w:fill="E8EEF5" w:color="auto" w:val="clear"/>
+            <w:tcMar>
+              <w:top w:type="dxa" w:w="40"/>
+              <w:left w:type="dxa" w:w="70"/>
+              <w:bottom w:type="dxa" w:w="40"/>
+              <w:right w:type="dxa" w:w="70"/>
+            </w:tcMar>
+          </w:tcPr>
+          <w:p>
+            <w:r>
+              <w:rPr>
+                <w:rFonts w:ascii="Arial" w:cs="Arial" w:eastAsia="Arial" w:hAnsi="Arial"/>
+                <w:b/>
+                <w:bCs/>
+                <w:i w:val="false"/>
+                <w:iCs w:val="false"/>
+                <w:sz w:val="15"/>
+                <w:szCs w:val="15"/>
+              </w:rPr>
+              <w:t xml:space="preserve">Date</w:t>
+            </w:r>
+          </w:p>
+        </w:tc>
+      </w:tr>
+      <w:tr>
+        <w:trPr>
+          <w:cantSplit/>
+          <w:tblHeader w:val="off"/>
+        </w:trPr>
+        <w:tc>
+          <w:tcPr>
+            <w:tcW w:type="dxa" w:w="3969"/>
+            <w:tcBorders>
+              <w:top w:val="single" w:color="999999" w:sz="4"/>
+              <w:left w:val="single" w:color="999999" w:sz="4"/>
+              <w:bottom w:val="single" w:color="999999" w:sz="4"/>
+              <w:right w:val="single" w:color="999999" w:sz="4"/>
+            </w:tcBorders>
+            <w:tcMar>
+              <w:top w:type="dxa" w:w="40"/>
+              <w:left w:type="dxa" w:w="70"/>
+              <w:bottom w:type="dxa" w:w="40"/>
+              <w:right w:type="dxa" w:w="70"/>
+            </w:tcMar>
+          </w:tcPr>
+          <w:p/>
+        </w:tc>
+        <w:tc>
+          <w:tcPr>
+            <w:tcW w:type="dxa" w:w="3969"/>
+            <w:tcBorders>
+              <w:top w:val="single" w:color="999999" w:sz="4"/>
+              <w:left w:val="single" w:color="999999" w:sz="4"/>
+              <w:bottom w:val="single" w:color="999999" w:sz="4"/>
+              <w:right w:val="single" w:color="999999" w:sz="4"/>
+            </w:tcBorders>
+            <w:tcMar>
+              <w:top w:type="dxa" w:w="40"/>
+              <w:left w:type="dxa" w:w="70"/>
+              <w:bottom w:type="dxa" w:w="40"/>
+              <w:right w:type="dxa" w:w="70"/>
+            </w:tcMar>
+          </w:tcPr>
+          <w:p/>
+        </w:tc>
+        <w:tc>
+          <w:tcPr>
+            <w:tcW w:type="dxa" w:w="2268"/>
+            <w:tcBorders>
+              <w:top w:val="single" w:color="999999" w:sz="4"/>
+              <w:left w:val="single" w:color="999999" w:sz="4"/>
+              <w:bottom w:val="single" w:color="999999" w:sz="4"/>
+              <w:right w:val="single" w:color="999999" w:sz="4"/>
+            </w:tcBorders>
+            <w:tcMar>
+              <w:top w:type="dxa" w:w="40"/>
+              <w:left w:type="dxa" w:w="70"/>
+              <w:bottom w:type="dxa" w:w="40"/>
+              <w:right w:type="dxa" w:w="70"/>
+            </w:tcMar>
+          </w:tcPr>
+          <w:p/>
+        </w:tc>
+      </w:tr>
+      <w:tr>
+        <w:trPr>
+          <w:cantSplit/>
+          <w:tblHeader w:val="off"/>
+        </w:trPr>
+        <w:tc>
+          <w:tcPr>
+            <w:tcW w:type="dxa" w:w="3969"/>
+            <w:tcBorders>
+              <w:top w:val="single" w:color="999999" w:sz="4"/>
+              <w:left w:val="single" w:color="999999" w:sz="4"/>
+              <w:bottom w:val="single" w:color="999999" w:sz="4"/>
+              <w:right w:val="single" w:color="999999" w:sz="4"/>
+            </w:tcBorders>
+            <w:tcMar>
+              <w:top w:type="dxa" w:w="40"/>
+              <w:left w:type="dxa" w:w="70"/>
+              <w:bottom w:type="dxa" w:w="40"/>
+              <w:right w:type="dxa" w:w="70"/>
+            </w:tcMar>
+          </w:tcPr>
+          <w:p/>
+        </w:tc>
+        <w:tc>
+          <w:tcPr>
+            <w:tcW w:type="dxa" w:w="3969"/>
+            <w:tcBorders>
+              <w:top w:val="single" w:color="999999" w:sz="4"/>
+              <w:left w:val="single" w:color="999999" w:sz="4"/>
+              <w:bottom w:val="single" w:color="999999" w:sz="4"/>
+              <w:right w:val="single" w:color="999999" w:sz="4"/>
+            </w:tcBorders>
+            <w:tcMar>
+              <w:top w:type="dxa" w:w="40"/>
+              <w:left w:type="dxa" w:w="70"/>
+              <w:bottom w:type="dxa" w:w="40"/>
+              <w:right w:type="dxa" w:w="70"/>
+            </w:tcMar>
+          </w:tcPr>
+          <w:p/>
+        </w:tc>
+        <w:tc>
+          <w:tcPr>
+            <w:tcW w:type="dxa" w:w="2268"/>
+            <w:tcBorders>
+              <w:top w:val="single" w:color="999999" w:sz="4"/>
+              <w:left w:val="single" w:color="999999" w:sz="4"/>
+              <w:bottom w:val="single" w:color="999999" w:sz="4"/>
+              <w:right w:val="single" w:color="999999" w:sz="4"/>
+            </w:tcBorders>
+            <w:tcMar>
+              <w:top w:type="dxa" w:w="40"/>
+              <w:left w:type="dxa" w:w="70"/>
+              <w:bottom w:type="dxa" w:w="40"/>
+              <w:right w:type="dxa" w:w="70"/>
+            </w:tcMar>
+          </w:tcPr>
+          <w:p/>
+        </w:tc>
+      </w:tr>
+    </w:tbl>
+    <w:p>
+      <w:pPr>
+        <w:spacing w:after="40"/>
+      </w:pPr>
     </w:p>
     <w:p>
       <w:pPr>

</xml_diff>